<commit_message>
feat: add management command to seed demo data and implement pagination for library catalog
- Created management command `seed_demo_data.py` to populate the database with demo data including books, users, loans, and reservations.
- Added pagination functionality with `LibraryPageNumberPagination` to manage the number of items displayed in the catalog.
- Developed the category browser page with HTML, CSS, and TypeScript to allow users to browse books by category, including loading states and error handling.
- Implemented modal for reservation confirmation and integrated it with the category browser.
</commit_message>
<xml_diff>
--- a/docs/Dokumentacja_Projektowa.docx
+++ b/docs/Dokumentacja_Projektowa.docx
@@ -879,7 +879,15 @@
           <w:sz w:val="28"/>
           <w:szCs w:val="28"/>
         </w:rPr>
-        <w:t>2.1.3 Administrator</w:t>
+        <w:t xml:space="preserve">2.1.3 </w:t>
+      </w:r>
+      <w:r>
+        <w:rPr>
+          <w:rStyle w:val="normaltextrun"/>
+          <w:sz w:val="28"/>
+          <w:szCs w:val="28"/>
+        </w:rPr>
+        <w:t>Biblotekarz</w:t>
       </w:r>
     </w:p>
     <w:p>
@@ -1104,7 +1112,11 @@
         <w:spacing w:before="120" w:after="120"/>
         <w:ind w:firstLine="705"/>
         <w:textAlignment w:val="baseline"/>
-        <w:rPr/>
+        <w:rPr>
+          <w:rStyle w:val="eop"/>
+          <w:sz w:val="28"/>
+          <w:szCs w:val="28"/>
+        </w:rPr>
       </w:pPr>
       <w:r>
         <w:rPr>
@@ -1113,23 +1125,6 @@
           <w:szCs w:val="28"/>
         </w:rPr>
         <w:t>3.8. Moduł zarządzania karami</w:t>
-      </w:r>
-    </w:p>
-    <w:p>
-      <w:pPr>
-        <w:pStyle w:val="paragraph"/>
-        <w:spacing w:before="120" w:after="120"/>
-        <w:ind w:firstLine="705"/>
-        <w:textAlignment w:val="baseline"/>
-        <w:rPr/>
-      </w:pPr>
-      <w:r>
-        <w:rPr>
-          <w:rStyle w:val="eop"/>
-          <w:sz w:val="28"/>
-          <w:szCs w:val="28"/>
-        </w:rPr>
-        <w:t xml:space="preserve">3.9. Moduł zamówień   </w:t>
       </w:r>
     </w:p>
     <w:p>
@@ -1777,7 +1772,7 @@
           <w:sz w:val="28"/>
           <w:szCs w:val="28"/>
         </w:rPr>
-        <w:t>biblotecznego</w:t>
+        <w:t>bibliotecznego</w:t>
       </w:r>
       <w:r>
         <w:rPr>
@@ -2035,7 +2030,7 @@
           <w:sz w:val="28"/>
           <w:szCs w:val="28"/>
         </w:rPr>
-        <w:t>***</w:t>
+        <w:t>EAN</w:t>
       </w:r>
       <w:r>
         <w:rPr>
@@ -2167,31 +2162,23 @@
           <w:sz w:val="28"/>
           <w:szCs w:val="28"/>
         </w:rPr>
-        <w:t xml:space="preserve">Wyświetlanie szczegółów wybranej książki wraz z okładką, opisem oraz aktualnym statusem dostępności poszczególnych egzemplarzy. </w:t>
-      </w:r>
-    </w:p>
-    <w:p>
-      <w:pPr>
-        <w:pStyle w:val="paragraph"/>
-        <w:numPr>
-          <w:ilvl w:val="0"/>
-          <w:numId w:val="4"/>
-        </w:numPr>
-        <w:spacing w:before="0" w:after="120"/>
-        <w:jc w:val="both"/>
-        <w:textAlignment w:val="baseline"/>
-        <w:rPr>
-          <w:sz w:val="28"/>
-          <w:szCs w:val="28"/>
-        </w:rPr>
-      </w:pPr>
-      <w:r>
-        <w:rPr>
-          <w:rStyle w:val="normaltextrun"/>
-          <w:sz w:val="28"/>
-          <w:szCs w:val="28"/>
-        </w:rPr>
-        <w:t xml:space="preserve">Wyznaczanie trasy – moduł wskazujący czytelnikowi lokalizację książki na terenie biblioteki lub trasę do odpowiedniej filii. </w:t>
+        <w:t xml:space="preserve">Wyświetlanie szczegółów wybranej książki </w:t>
+      </w:r>
+      <w:r>
+        <w:rPr>
+          <w:rStyle w:val="normaltextrun"/>
+          <w:sz w:val="28"/>
+          <w:szCs w:val="28"/>
+        </w:rPr>
+        <w:t xml:space="preserve">z </w:t>
+      </w:r>
+      <w:r>
+        <w:rPr>
+          <w:rStyle w:val="normaltextrun"/>
+          <w:sz w:val="28"/>
+          <w:szCs w:val="28"/>
+        </w:rPr>
+        <w:t xml:space="preserve">opisem oraz aktualnym statusem dostępności poszczególnych egzemplarzy. </w:t>
       </w:r>
     </w:p>
     <w:p>
@@ -2360,30 +2347,6 @@
     <w:p>
       <w:pPr>
         <w:pStyle w:val="paragraph"/>
-        <w:numPr>
-          <w:ilvl w:val="0"/>
-          <w:numId w:val="6"/>
-        </w:numPr>
-        <w:spacing w:before="0" w:after="120"/>
-        <w:jc w:val="both"/>
-        <w:textAlignment w:val="baseline"/>
-        <w:rPr>
-          <w:sz w:val="28"/>
-          <w:szCs w:val="28"/>
-        </w:rPr>
-      </w:pPr>
-      <w:r>
-        <w:rPr>
-          <w:rStyle w:val="normaltextrun"/>
-          <w:sz w:val="28"/>
-          <w:szCs w:val="28"/>
-        </w:rPr>
-        <w:t xml:space="preserve">Symulowany proces płatności online (np. BLIK, karta) umożliwiający szybkie opłacenie kary z poziomu konta czytelnika. </w:t>
-      </w:r>
-    </w:p>
-    <w:p>
-      <w:pPr>
-        <w:pStyle w:val="paragraph"/>
         <w:spacing w:before="120" w:after="120"/>
         <w:jc w:val="both"/>
         <w:textAlignment w:val="baseline"/>
@@ -2410,7 +2373,7 @@
           <w:szCs w:val="28"/>
           <w:lang w:eastAsia="pl-PL"/>
         </w:rPr>
-        <w:t>Panel administracyjny (Bibliotekarza):</w:t>
+        <w:t>Panel Bibliotekarza:</w:t>
       </w:r>
     </w:p>
     <w:p>
@@ -2482,7 +2445,23 @@
           <w:sz w:val="28"/>
           <w:szCs w:val="28"/>
         </w:rPr>
-        <w:t xml:space="preserve">Moduł zamówień – obsługa dezyderatów (propozycji zakupu zgłaszanych przez czytelników) oraz zarządzanie procesem wprowadzania nowości do księgozbioru. </w:t>
+        <w:t xml:space="preserve">Moduł zamówień – obsługa propozycji zakupu </w:t>
+      </w:r>
+      <w:r>
+        <w:rPr>
+          <w:rStyle w:val="normaltextrun"/>
+          <w:sz w:val="28"/>
+          <w:szCs w:val="28"/>
+        </w:rPr>
+        <w:t xml:space="preserve">pozycji </w:t>
+      </w:r>
+      <w:r>
+        <w:rPr>
+          <w:rStyle w:val="normaltextrun"/>
+          <w:sz w:val="28"/>
+          <w:szCs w:val="28"/>
+        </w:rPr>
+        <w:t xml:space="preserve">zgłaszanych przez czytelników oraz zarządzanie procesem wprowadzania nowości do księgozbioru. </w:t>
       </w:r>
     </w:p>
     <w:p>
@@ -2871,49 +2850,61 @@
           <w:sz w:val="28"/>
           <w:szCs w:val="28"/>
         </w:rPr>
-        <w:t xml:space="preserve">Jest to gość, który posiada aktywne konto biblioteczne i zalogował się w systemie. Stanowi on głównego odbiorcę usług oferowanych przez bibliotekę. Zazwyczaj jest to osoba poszukująca literatury do celów edukacyjnych, zawodowych lub rozrywkowych. Głównym celem czytelnika jest znalezienie interesującej go książki, wyznaczenie trasy do jej fizycznej lokalizacji, a następnie zarezerwowanie jej do odbioru lub zapisanie się na listę oczekujących. Czytelnik oczekuje od systemu wiarygodnej informacji o aktualnej dostępności zbiorów, płynnego przejścia przez cały cykl życia wypożyczenia oraz wygodnego mechanizmu opłacania ewentualnych kar systemowych. </w:t>
-      </w:r>
-    </w:p>
-    <w:p>
-      <w:pPr>
-        <w:pStyle w:val="paragraph"/>
-        <w:spacing w:before="120" w:after="120"/>
-        <w:jc w:val="both"/>
-        <w:textAlignment w:val="baseline"/>
-        <w:rPr/>
-      </w:pPr>
-      <w:r>
-        <w:rPr>
-          <w:rStyle w:val="normaltextrun"/>
+        <w:t>Jest to gość, który posiada aktywne konto biblioteczne i zalogował się w systemie. Stanowi on głównego odbiorcę usług oferowanych przez bibliotekę. Zazwyczaj jest to osoba poszukująca literatury do celów edukacyjnych, zawodowych lub rozrywkowych. Głównym celem czytelnika jest znalezienie interesującej go książki, następnie zarezerwowanie jej do odbioru lub zapisanie się na listę oczekujących. Czytelnik oczekuje od systemu wiarygodnej informacji o aktualnej dostępności zbiorów, płynnego przejścia przez cały cykl życia wypożyczenia.</w:t>
+      </w:r>
+    </w:p>
+    <w:p>
+      <w:pPr>
+        <w:pStyle w:val="paragraph"/>
+        <w:spacing w:before="120" w:after="120"/>
+        <w:jc w:val="both"/>
+        <w:textAlignment w:val="baseline"/>
+        <w:rPr>
+          <w:rStyle w:val="eop"/>
           <w:sz w:val="36"/>
           <w:szCs w:val="36"/>
         </w:rPr>
-        <w:t>2.1.3. Bibliotekarz(Administrator)</w:t>
-      </w:r>
-      <w:r>
-        <w:rPr>
-          <w:rStyle w:val="eop"/>
+      </w:pPr>
+      <w:r>
+        <w:rPr>
+          <w:rStyle w:val="normaltextrun"/>
           <w:sz w:val="36"/>
           <w:szCs w:val="36"/>
         </w:rPr>
-        <w:t> </w:t>
-      </w:r>
-    </w:p>
-    <w:p>
-      <w:pPr>
-        <w:pStyle w:val="paragraph"/>
-        <w:spacing w:before="120" w:after="120"/>
-        <w:jc w:val="both"/>
-        <w:textAlignment w:val="baseline"/>
-        <w:rPr/>
-      </w:pPr>
-      <w:r>
-        <w:rPr>
-          <w:rStyle w:val="eop"/>
-          <w:sz w:val="28"/>
-          <w:szCs w:val="28"/>
-        </w:rPr>
-        <w:t xml:space="preserve">Jest to pracownik biblioteki posiadający odpowiednie uprawnienia administracyjne, odpowiedzialny za nadzór nad prawidłowym funkcjonowaniem całego systemu oraz zarządzanie księgozbiorem. Celem bibliotekarza jest zapewnienie płynności obiegu książek oraz wsparcie czytelników. Do jego głównych zadań należy zarządzanie kontami użytkowników (w tym ich blokowanie w przypadku zaległości), zarządzanie fizyczną lokalizacją zbiorów i kontrolą ich stanu, autoryzacja operacji wypożyczeń i zwrotów, a także obsługa modułu zamówień (wprowadzanie nowości i weryfikacja dezyderatów). </w:t>
+        <w:t>2.1.3. Bibliotekarz</w:t>
+      </w:r>
+    </w:p>
+    <w:p>
+      <w:pPr>
+        <w:pStyle w:val="paragraph"/>
+        <w:spacing w:before="120" w:after="120"/>
+        <w:jc w:val="both"/>
+        <w:textAlignment w:val="baseline"/>
+        <w:rPr/>
+      </w:pPr>
+      <w:r>
+        <w:rPr>
+          <w:rStyle w:val="eop"/>
+          <w:sz w:val="28"/>
+          <w:szCs w:val="28"/>
+        </w:rPr>
+        <w:t xml:space="preserve">Jest to pracownik biblioteki posiadający odpowiednie uprawnienia, odpowiedzialny za nadzór nad prawidłowym funkcjonowaniem całego systemu oraz zarządzanie księgozbiorem. Celem bibliotekarza jest zapewnienie płynności obiegu książek oraz wsparcie czytelników. Do jego głównych zadań należy zarządzanie kontami użytkowników (w tym ich blokowanie w przypadku </w:t>
+      </w:r>
+      <w:r>
+        <w:rPr>
+          <w:rStyle w:val="eop"/>
+          <w:sz w:val="28"/>
+          <w:szCs w:val="28"/>
+        </w:rPr>
+        <w:t xml:space="preserve">notorycznych </w:t>
+      </w:r>
+      <w:r>
+        <w:rPr>
+          <w:rStyle w:val="eop"/>
+          <w:sz w:val="28"/>
+          <w:szCs w:val="28"/>
+        </w:rPr>
+        <w:t xml:space="preserve">zaległości), zarządzanie fizyczną lokalizacją zbiorów i kontrolą ich stanu, autoryzacja operacji wypożyczeń i zwrotów, a także obsługa modułu zamówień. </w:t>
       </w:r>
     </w:p>
     <w:p>
@@ -2964,29 +2955,6 @@
           <w:szCs w:val="28"/>
         </w:rPr>
         <w:t> </w:t>
-      </w:r>
-    </w:p>
-    <w:p>
-      <w:pPr>
-        <w:pStyle w:val="paragraph"/>
-        <w:numPr>
-          <w:ilvl w:val="0"/>
-          <w:numId w:val="8"/>
-        </w:numPr>
-        <w:spacing w:before="120" w:after="0"/>
-        <w:jc w:val="both"/>
-        <w:textAlignment w:val="baseline"/>
-        <w:rPr/>
-      </w:pPr>
-      <w:r>
-        <w:rPr>
-          <w:rStyle w:val="normaltextrun"/>
-          <w:b w:val="false"/>
-          <w:bCs w:val="false"/>
-          <w:sz w:val="28"/>
-          <w:szCs w:val="28"/>
-        </w:rPr>
-        <w:t xml:space="preserve">Kompetencje użytkowników: Zakłada się, że wszyscy użytkownicy (zarówno czytelnicy, jak i pracownicy biblioteki) posiadają podstawowe umiejętności obsługi komputera oraz przeglądarki internetowej. </w:t>
       </w:r>
     </w:p>
     <w:p>
@@ -3033,29 +3001,6 @@
           <w:szCs w:val="28"/>
         </w:rPr>
         <w:t xml:space="preserve">Wiarygodność danych: Zakłada się, że czytelnicy podają prawdziwe dane podczas rejestracji, a bibliotekarze rzetelnie i na bieżąco aktualizują katalog książek, ich fizyczną lokalizację oraz statusy wypożyczeń. Od precyzji tych danych zależy prawidłowe działanie modułu estymacji czasu oczekiwania. </w:t>
-      </w:r>
-    </w:p>
-    <w:p>
-      <w:pPr>
-        <w:pStyle w:val="paragraph"/>
-        <w:numPr>
-          <w:ilvl w:val="0"/>
-          <w:numId w:val="8"/>
-        </w:numPr>
-        <w:spacing w:before="0" w:after="120"/>
-        <w:jc w:val="both"/>
-        <w:textAlignment w:val="baseline"/>
-        <w:rPr/>
-      </w:pPr>
-      <w:r>
-        <w:rPr>
-          <w:rStyle w:val="eop"/>
-          <w:b w:val="false"/>
-          <w:bCs w:val="false"/>
-          <w:sz w:val="28"/>
-          <w:szCs w:val="28"/>
-        </w:rPr>
-        <w:t xml:space="preserve">Stabilność wymagań: Kluczowe wymagania funkcjonalne określone w projekcie (np. cykl życia wypożyczenia, obsługa kar) nie ulegną znaczącym zmianom w trakcie fazy implementacji. </w:t>
       </w:r>
     </w:p>
     <w:p>
@@ -3224,7 +3169,27 @@
           <w:sz w:val="28"/>
           <w:szCs w:val="28"/>
         </w:rPr>
-        <w:t xml:space="preserve">Wyszukiwanie proste i zaawansowane: Użytkownik może wyszukiwać pozycje po tytule, autorze, numerze ISBN, słowach kluczowych czy gatunku. </w:t>
+        <w:t xml:space="preserve">Wyszukiwanie proste i zaawansowane: Użytkownik może wyszukiwać pozycje po tytule, autorze, numerze </w:t>
+      </w:r>
+      <w:r>
+        <w:rPr>
+          <w:rStyle w:val="normaltextrun"/>
+          <w:b w:val="false"/>
+          <w:bCs w:val="false"/>
+          <w:sz w:val="28"/>
+          <w:szCs w:val="28"/>
+        </w:rPr>
+        <w:t>EAN</w:t>
+      </w:r>
+      <w:r>
+        <w:rPr>
+          <w:rStyle w:val="normaltextrun"/>
+          <w:b w:val="false"/>
+          <w:bCs w:val="false"/>
+          <w:sz w:val="28"/>
+          <w:szCs w:val="28"/>
+        </w:rPr>
+        <w:t xml:space="preserve">, słowach kluczowych czy gatunku. </w:t>
       </w:r>
       <w:r>
         <w:rPr>
@@ -3290,7 +3255,7 @@
           <w:sz w:val="28"/>
           <w:szCs w:val="28"/>
         </w:rPr>
-        <w:t xml:space="preserve">Wyświetlanie szczegółów pozycji: Prezentacja pełnych metadanych książki, opisu, okładki oraz aktualnej dostępności egzemplarzy. </w:t>
+        <w:t xml:space="preserve">Wyświetlanie szczegółów pozycji: Prezentacja pełnych metadanych książki, opisu oraz aktualnej dostępności egzemplarzy. </w:t>
       </w:r>
     </w:p>
     <w:p>
@@ -3338,7 +3303,27 @@
           <w:sz w:val="28"/>
           <w:szCs w:val="28"/>
         </w:rPr>
-        <w:t xml:space="preserve">Rejestracja i logowanie: Zakładanie konta czytelnika i uwierzytelnianie użytkowników (czytelników, bibliotekarzy, administratorów). </w:t>
+        <w:t>Rejestracja i logowanie: Zakładanie konta czytelnika i uwierzytelnianie użytkowników (czytelników, bibliotekarzy</w:t>
+      </w:r>
+      <w:r>
+        <w:rPr>
+          <w:rStyle w:val="eop"/>
+          <w:b w:val="false"/>
+          <w:bCs w:val="false"/>
+          <w:sz w:val="28"/>
+          <w:szCs w:val="28"/>
+        </w:rPr>
+        <w:t>)</w:t>
+      </w:r>
+      <w:r>
+        <w:rPr>
+          <w:rStyle w:val="eop"/>
+          <w:b w:val="false"/>
+          <w:bCs w:val="false"/>
+          <w:sz w:val="28"/>
+          <w:szCs w:val="28"/>
+        </w:rPr>
+        <w:t xml:space="preserve">. </w:t>
       </w:r>
     </w:p>
     <w:p>
@@ -3367,29 +3352,6 @@
     <w:p>
       <w:pPr>
         <w:pStyle w:val="paragraph"/>
-        <w:numPr>
-          <w:ilvl w:val="0"/>
-          <w:numId w:val="10"/>
-        </w:numPr>
-        <w:spacing w:before="0" w:after="0"/>
-        <w:jc w:val="both"/>
-        <w:textAlignment w:val="baseline"/>
-        <w:rPr/>
-      </w:pPr>
-      <w:r>
-        <w:rPr>
-          <w:rStyle w:val="normaltextrun"/>
-          <w:b w:val="false"/>
-          <w:bCs w:val="false"/>
-          <w:sz w:val="28"/>
-          <w:szCs w:val="28"/>
-        </w:rPr>
-        <w:t xml:space="preserve">Autoryzacja akcji krytycznych: Wymóg dodatkowego potwierdzenia tożsamości (np. hasłem, kodem PIN lub kartą biblioteczną) przy wypożyczaniu cennych zbiorów lub zatwierdzaniu kar. </w:t>
-      </w:r>
-    </w:p>
-    <w:p>
-      <w:pPr>
-        <w:pStyle w:val="paragraph"/>
         <w:spacing w:before="120" w:after="120"/>
         <w:jc w:val="both"/>
         <w:textAlignment w:val="baseline"/>
@@ -3442,29 +3404,6 @@
     <w:p>
       <w:pPr>
         <w:pStyle w:val="paragraph"/>
-        <w:numPr>
-          <w:ilvl w:val="0"/>
-          <w:numId w:val="11"/>
-        </w:numPr>
-        <w:spacing w:before="0" w:after="0"/>
-        <w:jc w:val="both"/>
-        <w:textAlignment w:val="baseline"/>
-        <w:rPr/>
-      </w:pPr>
-      <w:r>
-        <w:rPr>
-          <w:rStyle w:val="eop"/>
-          <w:b w:val="false"/>
-          <w:bCs w:val="false"/>
-          <w:sz w:val="28"/>
-          <w:szCs w:val="28"/>
-        </w:rPr>
-        <w:t xml:space="preserve">Aktualizacja położenia w czasie rzeczywistym: Zmiana statusu lokalizacji egzemplarza (np. na wózku do odłożenia, w czytelni, na półce) po zwrocie lub przeniesieniu przez pracownika. </w:t>
-      </w:r>
-    </w:p>
-    <w:p>
-      <w:pPr>
-        <w:pStyle w:val="paragraph"/>
         <w:spacing w:before="120" w:after="120"/>
         <w:jc w:val="both"/>
         <w:textAlignment w:val="baseline"/>
@@ -3654,33 +3593,6 @@
           <w:sz w:val="28"/>
           <w:szCs w:val="28"/>
         </w:rPr>
-        <w:t xml:space="preserve">Estymacja czasu oczekiwania: Algorytm obliczający przybliżony czas dostępności książki na podstawie liczby osób w kolejce i średniego czasu przetrzymywania książki. </w:t>
-      </w:r>
-    </w:p>
-    <w:p>
-      <w:pPr>
-        <w:pStyle w:val="paragraph"/>
-        <w:numPr>
-          <w:ilvl w:val="0"/>
-          <w:numId w:val="12"/>
-        </w:numPr>
-        <w:spacing w:before="0" w:after="120"/>
-        <w:jc w:val="both"/>
-        <w:textAlignment w:val="baseline"/>
-        <w:rPr>
-          <w:b w:val="false"/>
-          <w:bCs w:val="false"/>
-          <w:sz w:val="28"/>
-          <w:szCs w:val="28"/>
-        </w:rPr>
-      </w:pPr>
-      <w:r>
-        <w:rPr>
-          <w:b w:val="false"/>
-          <w:bCs w:val="false"/>
-          <w:sz w:val="28"/>
-          <w:szCs w:val="28"/>
-        </w:rPr>
         <w:t xml:space="preserve">Automatyczne przesunięcia w kolejce: Zarządzanie kolejką w przypadku rezygnacji użytkownika lub braku odbioru zarezerwowanej książki w terminie. </w:t>
       </w:r>
     </w:p>
@@ -3733,7 +3645,7 @@
           <w:sz w:val="28"/>
           <w:szCs w:val="28"/>
         </w:rPr>
-        <w:t xml:space="preserve">Powiadomienia o zbliżającym się terminie zwrotu: Automatyczne wysyłanie e-maili/SMS/powiadomień push przypominających o konieczności zwrotu. </w:t>
+        <w:t xml:space="preserve">Powiadomienia o zbliżającym się terminie zwrotu: Automatyczne wysyłanie powiadomień przypominających o konieczności zwrotu. </w:t>
       </w:r>
     </w:p>
     <w:p>
@@ -3875,29 +3787,6 @@
           <w:szCs w:val="28"/>
         </w:rPr>
         <w:t> </w:t>
-      </w:r>
-    </w:p>
-    <w:p>
-      <w:pPr>
-        <w:pStyle w:val="paragraph"/>
-        <w:numPr>
-          <w:ilvl w:val="0"/>
-          <w:numId w:val="13"/>
-        </w:numPr>
-        <w:spacing w:before="0" w:after="120"/>
-        <w:jc w:val="both"/>
-        <w:textAlignment w:val="baseline"/>
-        <w:rPr/>
-      </w:pPr>
-      <w:r>
-        <w:rPr>
-          <w:rStyle w:val="normaltextrun"/>
-          <w:b w:val="false"/>
-          <w:bCs w:val="false"/>
-          <w:sz w:val="28"/>
-          <w:szCs w:val="28"/>
-        </w:rPr>
-        <w:t>Inwentaryzacja zużycia: Zliczanie cykli wypożyczeń w celu typowania starych i zniszczonych egzemplarzy do usunięcia (ubytkowania) z inwentarza.</w:t>
       </w:r>
     </w:p>
     <w:p>
@@ -3990,150 +3879,20 @@
           <w:ilvl w:val="0"/>
           <w:numId w:val="13"/>
         </w:numPr>
-        <w:spacing w:before="0" w:after="0"/>
-        <w:jc w:val="both"/>
-        <w:textAlignment w:val="baseline"/>
-        <w:rPr/>
-      </w:pPr>
-      <w:r>
-        <w:rPr>
-          <w:rStyle w:val="eop"/>
+        <w:spacing w:before="0" w:after="120"/>
+        <w:jc w:val="both"/>
+        <w:textAlignment w:val="baseline"/>
+        <w:rPr/>
+      </w:pPr>
+      <w:r>
+        <w:rPr>
+          <w:rStyle w:val="normaltextrun"/>
           <w:b w:val="false"/>
           <w:bCs w:val="false"/>
           <w:sz w:val="28"/>
           <w:szCs w:val="28"/>
         </w:rPr>
-        <w:t xml:space="preserve">Blokada konta: Automatyczne blokowanie możliwości kolejnych wypożyczeń po przekroczeniu określonego limitu kar lub czasu zwłoki. </w:t>
-      </w:r>
-    </w:p>
-    <w:p>
-      <w:pPr>
-        <w:pStyle w:val="paragraph"/>
-        <w:numPr>
-          <w:ilvl w:val="0"/>
-          <w:numId w:val="13"/>
-        </w:numPr>
-        <w:spacing w:before="0" w:after="120"/>
-        <w:jc w:val="both"/>
-        <w:textAlignment w:val="baseline"/>
-        <w:rPr/>
-      </w:pPr>
-      <w:r>
-        <w:rPr>
-          <w:rStyle w:val="normaltextrun"/>
-          <w:b w:val="false"/>
-          <w:bCs w:val="false"/>
-          <w:sz w:val="28"/>
-          <w:szCs w:val="28"/>
-        </w:rPr>
-        <w:t xml:space="preserve">Obsługa płatności: Rejestrowanie uregulowania kar gotówką u bibliotekarza lub poprzez integrację z bramkami płatności online. </w:t>
-      </w:r>
-    </w:p>
-    <w:p>
-      <w:pPr>
-        <w:pStyle w:val="paragraph"/>
-        <w:spacing w:before="0" w:after="120"/>
-        <w:jc w:val="both"/>
-        <w:textAlignment w:val="baseline"/>
-        <w:rPr/>
-      </w:pPr>
-      <w:r>
-        <w:rPr>
-          <w:rStyle w:val="normaltextrun"/>
-          <w:b w:val="false"/>
-          <w:bCs w:val="false"/>
-          <w:sz w:val="28"/>
-          <w:szCs w:val="28"/>
-        </w:rPr>
-        <w:tab/>
-      </w:r>
-    </w:p>
-    <w:p>
-      <w:pPr>
-        <w:pStyle w:val="paragraph"/>
-        <w:spacing w:before="0" w:after="120"/>
-        <w:jc w:val="both"/>
-        <w:textAlignment w:val="baseline"/>
-        <w:rPr/>
-      </w:pPr>
-      <w:r>
-        <w:rPr>
-          <w:rStyle w:val="normaltextrun"/>
-          <w:b w:val="false"/>
-          <w:bCs w:val="false"/>
-          <w:sz w:val="36"/>
-          <w:szCs w:val="36"/>
-        </w:rPr>
-        <w:t xml:space="preserve">3.9. Moduł zamówień </w:t>
-      </w:r>
-    </w:p>
-    <w:p>
-      <w:pPr>
-        <w:pStyle w:val="paragraph"/>
-        <w:numPr>
-          <w:ilvl w:val="0"/>
-          <w:numId w:val="13"/>
-        </w:numPr>
-        <w:spacing w:before="120" w:after="0"/>
-        <w:jc w:val="both"/>
-        <w:textAlignment w:val="baseline"/>
-        <w:rPr/>
-      </w:pPr>
-      <w:r>
-        <w:rPr>
-          <w:rStyle w:val="eop"/>
-          <w:b w:val="false"/>
-          <w:bCs w:val="false"/>
-          <w:sz w:val="28"/>
-          <w:szCs w:val="28"/>
-        </w:rPr>
-        <w:t xml:space="preserve">Składanie dezyderatów (Propozycje zakupu): Zgłaszanie przez czytelników propozycji książek, których brakuje w księgozbiorze. </w:t>
-      </w:r>
-    </w:p>
-    <w:p>
-      <w:pPr>
-        <w:pStyle w:val="paragraph"/>
-        <w:numPr>
-          <w:ilvl w:val="0"/>
-          <w:numId w:val="13"/>
-        </w:numPr>
-        <w:spacing w:before="0" w:after="0"/>
-        <w:jc w:val="both"/>
-        <w:textAlignment w:val="baseline"/>
-        <w:rPr/>
-      </w:pPr>
-      <w:r>
-        <w:rPr>
-          <w:rStyle w:val="eop"/>
-          <w:b w:val="false"/>
-          <w:bCs w:val="false"/>
-          <w:sz w:val="28"/>
-          <w:szCs w:val="28"/>
-        </w:rPr>
-        <w:t xml:space="preserve">Zarządzanie zakupami przez bibliotekę: Tworzenie list zamówień nowych pozycji u dostawców/wydawnictw, śledzenie statusu zamówienia. </w:t>
-      </w:r>
-    </w:p>
-    <w:p>
-      <w:pPr>
-        <w:pStyle w:val="paragraph"/>
-        <w:numPr>
-          <w:ilvl w:val="0"/>
-          <w:numId w:val="13"/>
-        </w:numPr>
-        <w:spacing w:before="0" w:after="120"/>
-        <w:jc w:val="both"/>
-        <w:textAlignment w:val="baseline"/>
-        <w:rPr/>
-      </w:pPr>
-      <w:r>
-        <w:rPr>
-          <w:rStyle w:val="normaltextrun"/>
-          <w:b w:val="false"/>
-          <w:bCs w:val="false"/>
-          <w:sz w:val="28"/>
-          <w:szCs w:val="28"/>
-        </w:rPr>
-        <w:t xml:space="preserve">Wprowadzanie nowości do systemu: Przekształcanie zrealizowanego zamówienia w nowe pozycje w katalogu (nadawanie kodów kreskowych, RFID).  </w:t>
+        <w:t>Obsługa płatności: Rejestrowanie uregulowania kar gotówką u bibliotekarza.</w:t>
       </w:r>
       <w:r>
         <w:br w:type="page"/>
@@ -4238,29 +3997,6 @@
     <w:p>
       <w:pPr>
         <w:pStyle w:val="paragraph"/>
-        <w:numPr>
-          <w:ilvl w:val="0"/>
-          <w:numId w:val="16"/>
-        </w:numPr>
-        <w:spacing w:before="0" w:after="120"/>
-        <w:jc w:val="both"/>
-        <w:textAlignment w:val="baseline"/>
-        <w:rPr/>
-      </w:pPr>
-      <w:r>
-        <w:rPr>
-          <w:rStyle w:val="eop"/>
-          <w:b w:val="false"/>
-          <w:bCs w:val="false"/>
-          <w:sz w:val="28"/>
-          <w:szCs w:val="28"/>
-        </w:rPr>
-        <w:t xml:space="preserve">Obsługa obciążenia: System musi być w stanie obsłużyć co najmniej 50 jednoczesnych, niezalogowanych użytkowników (gości) przeglądających katalog książek bez widocznego spadku wydajności. </w:t>
-      </w:r>
-    </w:p>
-    <w:p>
-      <w:pPr>
-        <w:pStyle w:val="paragraph"/>
         <w:spacing w:before="120" w:after="120"/>
         <w:jc w:val="both"/>
         <w:textAlignment w:val="baseline"/>
@@ -4330,7 +4066,7 @@
           <w:sz w:val="28"/>
           <w:szCs w:val="28"/>
         </w:rPr>
-        <w:t xml:space="preserve">Autoryzacja: Dostęp do poszczególnych modułów i operacji (np. autoryzacja wypożyczeń, kontrola stanu fizycznego, zarządzanie bazą użytkowników) musi być ściśle kontrolowany na podstawie przypisanych ról (Czytelnik, Bibliotekarz/Administrator). </w:t>
+        <w:t xml:space="preserve">Autoryzacja: Dostęp do poszczególnych modułów i operacji (np. autoryzacja wypożyczeń, kontrola stanu fizycznego, zarządzanie bazą użytkowników) musi być ściśle kontrolowany na podstawie przypisanych ról (Czytelnik, Bibliotekarz). </w:t>
       </w:r>
     </w:p>
     <w:p>
@@ -4360,29 +4096,6 @@
           <w:szCs w:val="36"/>
         </w:rPr>
         <w:t> </w:t>
-      </w:r>
-    </w:p>
-    <w:p>
-      <w:pPr>
-        <w:pStyle w:val="paragraph"/>
-        <w:numPr>
-          <w:ilvl w:val="0"/>
-          <w:numId w:val="18"/>
-        </w:numPr>
-        <w:spacing w:before="120" w:after="0"/>
-        <w:jc w:val="both"/>
-        <w:textAlignment w:val="baseline"/>
-        <w:rPr/>
-      </w:pPr>
-      <w:r>
-        <w:rPr>
-          <w:rStyle w:val="eop"/>
-          <w:b w:val="false"/>
-          <w:bCs w:val="false"/>
-          <w:sz w:val="28"/>
-          <w:szCs w:val="28"/>
-        </w:rPr>
-        <w:t xml:space="preserve">Dostępność: System powinien być dostępny dla użytkowników przez większość czasu (wysoka dostępność), dopuszczając jedynie krótkie przerwy na planowane prace konserwacyjne i aktualizacje bazy danych. </w:t>
       </w:r>
     </w:p>
     <w:p>

</xml_diff>